<commit_message>
Header lockup + tagline, mobile nav, footer fix, nav sweep + icons, Threads link
</commit_message>
<xml_diff>
--- a/Shane_Maris_Resume.docx
+++ b/Shane_Maris_Resume.docx
@@ -48,7 +48,7 @@
     </w:p>
     <w:p>
       <w:r>
-        <w:t>Design operations and systems leader with 12+ years designing at enterprise scale. Built Heart Design System from vision to governance framework serving web, iOS, and Android. Proven ability to secure leadership buy-in, establish strategic direction, and scale design infrastructure across organizational boundaries.</w:t>
+        <w:t>Design operations and systems leader with 15+ years designing at enterprise scale. Built Heart Design System from vision to governance framework serving web, iOS, and Android. Proven ability to secure leadership buy-in, establish strategic direction, and scale design infrastructure across organizational boundaries.</w:t>
       </w:r>
     </w:p>
     <w:p>
@@ -75,7 +75,7 @@
           <w:color w:val="1C1B17"/>
           <w:sz w:val="22"/>
         </w:rPr>
-        <w:t xml:space="preserve"> • 2022 – Present</w:t>
+        <w:t xml:space="preserve"> • Dec 2022 – Present</w:t>
       </w:r>
     </w:p>
     <w:p>
@@ -145,7 +145,7 @@
           <w:color w:val="1C1B17"/>
           <w:sz w:val="22"/>
         </w:rPr>
-        <w:t xml:space="preserve"> • 2022 – 2022</w:t>
+        <w:t xml:space="preserve"> • Mar 2022 – Dec 2022</w:t>
       </w:r>
     </w:p>
     <w:p>
@@ -202,7 +202,7 @@
           <w:color w:val="1C1B17"/>
           <w:sz w:val="22"/>
         </w:rPr>
-        <w:t xml:space="preserve"> • 2019 – 2022</w:t>
+        <w:t xml:space="preserve"> • Feb 2019 – Mar 2022</w:t>
       </w:r>
     </w:p>
     <w:p>
@@ -259,7 +259,7 @@
           <w:color w:val="1C1B17"/>
           <w:sz w:val="22"/>
         </w:rPr>
-        <w:t xml:space="preserve"> • 2014 – 2019</w:t>
+        <w:t xml:space="preserve"> • Apr 2014 – Feb 2019</w:t>
       </w:r>
     </w:p>
     <w:p>
@@ -299,6 +299,94 @@
           <w:sz w:val="20"/>
         </w:rPr>
         <w:t>Conducted individual A/B tests and iterative design improvements across customer journey</w:t>
+      </w:r>
+    </w:p>
+    <w:p/>
+    <w:p>
+      <w:r>
+        <w:rPr>
+          <w:b/>
+          <w:color w:val="1C1B17"/>
+          <w:sz w:val="22"/>
+        </w:rPr>
+        <w:t>Web Designer</w:t>
+      </w:r>
+      <w:r>
+        <w:rPr>
+          <w:color w:val="1C1B17"/>
+          <w:sz w:val="22"/>
+        </w:rPr>
+        <w:t xml:space="preserve"> • Feb 2012 – Apr 2014</w:t>
+      </w:r>
+    </w:p>
+    <w:p>
+      <w:pPr>
+        <w:pStyle w:val="ListBullet"/>
+        <w:ind w:left="360"/>
+      </w:pPr>
+      <w:r>
+        <w:rPr>
+          <w:color w:val="1C1B17"/>
+          <w:sz w:val="20"/>
+        </w:rPr>
+        <w:t>Transitioned from contractor to FTE, supporting content creation across Southwest’s Digital Channels</w:t>
+      </w:r>
+    </w:p>
+    <w:p>
+      <w:pPr>
+        <w:pStyle w:val="ListBullet"/>
+        <w:ind w:left="360"/>
+      </w:pPr>
+      <w:r>
+        <w:rPr>
+          <w:color w:val="1C1B17"/>
+          <w:sz w:val="20"/>
+        </w:rPr>
+        <w:t>Managed production timelines, ensuring consistency and delivery across marketing and digital properties</w:t>
+      </w:r>
+    </w:p>
+    <w:p/>
+    <w:p>
+      <w:r>
+        <w:rPr>
+          <w:b/>
+          <w:color w:val="1C1B17"/>
+          <w:sz w:val="22"/>
+        </w:rPr>
+        <w:t>UX Designer (Contractor)</w:t>
+      </w:r>
+      <w:r>
+        <w:rPr>
+          <w:color w:val="1C1B17"/>
+          <w:sz w:val="22"/>
+        </w:rPr>
+        <w:t xml:space="preserve"> • Aug 2011 – Feb 2012</w:t>
+      </w:r>
+    </w:p>
+    <w:p>
+      <w:pPr>
+        <w:pStyle w:val="ListBullet"/>
+        <w:ind w:left="360"/>
+      </w:pPr>
+      <w:r>
+        <w:rPr>
+          <w:color w:val="1C1B17"/>
+          <w:sz w:val="20"/>
+        </w:rPr>
+        <w:t>Integrated AirTran’s digital presence into the Southwest ecosystem following acquisition</w:t>
+      </w:r>
+    </w:p>
+    <w:p>
+      <w:pPr>
+        <w:pStyle w:val="ListBullet"/>
+        <w:ind w:left="360"/>
+      </w:pPr>
+      <w:r>
+        <w:rPr>
+          <w:color w:val="1C1B17"/>
+          <w:sz w:val="20"/>
+        </w:rPr>
+        <w:t>Collaborated with SMEs to establish UX and digital best practices, laying groundwork for future design operations</w:t>
       </w:r>
     </w:p>
     <w:p/>

</xml_diff>